<commit_message>
Travail jour5 et update readme
</commit_message>
<xml_diff>
--- a/Jour4/Sujet/Jour 4 — Validation des données.docx
+++ b/Jour4/Sujet/Jour 4 — Validation des données.docx
@@ -78,120 +78,20 @@
       <w:pPr>
         <w:numPr>
           <w:ilvl w:val="0"/>
-          <w:numId w:val="4"/>
+          <w:numId w:val="2"/>
         </w:numPr>
-        <w:spacing w:after="0" w:afterAutospacing="0" w:lineRule="auto"/>
+        <w:spacing w:after="0" w:before="0" w:lineRule="auto"/>
         <w:ind w:left="720" w:hanging="360"/>
-      </w:pPr>
-      <w:r>
-        <w:rPr>
-          <w:rFonts w:ascii="Times New Roman" w:cs="Times New Roman" w:eastAsia="Times New Roman" w:hAnsi="Times New Roman"/>
-          <w:b w:val="1"/>
-          <w:bCs w:val="1"/>
+        <w:rPr>
+          <w:rFonts w:ascii="Times New Roman" w:cs="Times New Roman" w:eastAsia="Times New Roman" w:hAnsi="Times New Roman"/>
+        </w:rPr>
+      </w:pPr>
+      <w:r>
+        <w:rPr>
+          <w:rFonts w:ascii="Times New Roman" w:cs="Times New Roman" w:eastAsia="Times New Roman" w:hAnsi="Times New Roman"/>
           <w:rtl w:val="0"/>
         </w:rPr>
         <w:t xml:space="preserve">Qu'est-ce que la validation des données dans Excel ?</w:t>
-        <w:br w:type="textWrapping"/>
-      </w:r>
-      <w:r>
-        <w:rPr>
-          <w:rFonts w:ascii="Times New Roman" w:cs="Times New Roman" w:eastAsia="Times New Roman" w:hAnsi="Times New Roman"/>
-          <w:rtl w:val="0"/>
-        </w:rPr>
-        <w:t xml:space="preserve"> La validation des données permet de </w:t>
-      </w:r>
-      <w:r>
-        <w:rPr>
-          <w:rFonts w:ascii="Times New Roman" w:cs="Times New Roman" w:eastAsia="Times New Roman" w:hAnsi="Times New Roman"/>
-          <w:b w:val="1"/>
-          <w:bCs w:val="1"/>
-          <w:rtl w:val="0"/>
-        </w:rPr>
-        <w:t xml:space="preserve">contrôler ce qu’un utilisateur peut saisir</w:t>
-      </w:r>
-      <w:r>
-        <w:rPr>
-          <w:rFonts w:ascii="Times New Roman" w:cs="Times New Roman" w:eastAsia="Times New Roman" w:hAnsi="Times New Roman"/>
-          <w:rtl w:val="0"/>
-        </w:rPr>
-        <w:t xml:space="preserve"> dans une cellule.</w:t>
-      </w:r>
-    </w:p>
-    <w:p>
-      <w:pPr>
-        <w:numPr>
-          <w:ilvl w:val="0"/>
-          <w:numId w:val="4"/>
-        </w:numPr>
-        <w:spacing w:after="0" w:afterAutospacing="0" w:lineRule="auto"/>
-        <w:ind w:left="1440" w:hanging="360"/>
-      </w:pPr>
-      <w:r>
-        <w:rPr>
-          <w:rFonts w:ascii="Times New Roman" w:cs="Times New Roman" w:eastAsia="Times New Roman" w:hAnsi="Times New Roman"/>
-          <w:b w:val="1"/>
-          <w:bCs w:val="1"/>
-          <w:rtl w:val="0"/>
-        </w:rPr>
-        <w:t xml:space="preserve">Différence entre liste déroulante et restriction numérique :</w:t>
-      </w:r>
-    </w:p>
-    <w:p>
-      <w:pPr>
-        <w:numPr>
-          <w:ilvl w:val="0"/>
-          <w:numId w:val="8"/>
-        </w:numPr>
-        <w:spacing w:after="0" w:afterAutospacing="0" w:before="0" w:beforeAutospacing="0" w:lineRule="auto"/>
-        <w:ind w:left="1440" w:hanging="360"/>
-        <w:rPr>
-          <w:rFonts w:ascii="Times New Roman" w:cs="Times New Roman" w:eastAsia="Times New Roman" w:hAnsi="Times New Roman"/>
-        </w:rPr>
-      </w:pPr>
-      <w:r>
-        <w:rPr>
-          <w:rFonts w:ascii="Times New Roman" w:cs="Times New Roman" w:eastAsia="Times New Roman" w:hAnsi="Times New Roman"/>
-          <w:b w:val="1"/>
-          <w:bCs w:val="1"/>
-          <w:rtl w:val="0"/>
-        </w:rPr>
-        <w:t xml:space="preserve">Liste déroulante</w:t>
-      </w:r>
-      <w:r>
-        <w:rPr>
-          <w:rFonts w:ascii="Times New Roman" w:cs="Times New Roman" w:eastAsia="Times New Roman" w:hAnsi="Times New Roman"/>
-          <w:rtl w:val="0"/>
-        </w:rPr>
-        <w:t xml:space="preserve"> : permet de choisir une valeur parmi une liste prédéfinie.</w:t>
-      </w:r>
-    </w:p>
-    <w:p>
-      <w:pPr>
-        <w:numPr>
-          <w:ilvl w:val="0"/>
-          <w:numId w:val="8"/>
-        </w:numPr>
-        <w:spacing w:after="0" w:afterAutospacing="0" w:before="0" w:beforeAutospacing="0" w:lineRule="auto"/>
-        <w:ind w:left="1440" w:hanging="360"/>
-        <w:rPr>
-          <w:rFonts w:ascii="Times New Roman" w:cs="Times New Roman" w:eastAsia="Times New Roman" w:hAnsi="Times New Roman"/>
-        </w:rPr>
-      </w:pPr>
-      <w:r>
-        <w:rPr>
-          <w:rFonts w:ascii="Times New Roman" w:cs="Times New Roman" w:eastAsia="Times New Roman" w:hAnsi="Times New Roman"/>
-          <w:b w:val="1"/>
-          <w:bCs w:val="1"/>
-          <w:rtl w:val="0"/>
-        </w:rPr>
-        <w:t xml:space="preserve">Restriction numérique</w:t>
-      </w:r>
-      <w:r>
-        <w:rPr>
-          <w:rFonts w:ascii="Times New Roman" w:cs="Times New Roman" w:eastAsia="Times New Roman" w:hAnsi="Times New Roman"/>
-          <w:rtl w:val="0"/>
-        </w:rPr>
-        <w:t xml:space="preserve"> : impose une condition sur un nombre, par exemple entre 0 et 20.</w:t>
       </w:r>
     </w:p>
     <w:p>
@@ -200,44 +100,31 @@
           <w:ilvl w:val="0"/>
           <w:numId w:val="2"/>
         </w:numPr>
-        <w:spacing w:after="0" w:afterAutospacing="0" w:before="0" w:beforeAutospacing="0" w:lineRule="auto"/>
+        <w:spacing w:after="0" w:before="0" w:lineRule="auto"/>
         <w:ind w:left="720" w:hanging="360"/>
-        <w:rPr>
-          <w:rFonts w:ascii="Times New Roman" w:cs="Times New Roman" w:eastAsia="Times New Roman" w:hAnsi="Times New Roman"/>
-        </w:rPr>
-      </w:pPr>
-      <w:r>
-        <w:rPr>
-          <w:rFonts w:ascii="Times New Roman" w:cs="Times New Roman" w:eastAsia="Times New Roman" w:hAnsi="Times New Roman"/>
-          <w:b w:val="1"/>
-          <w:bCs w:val="1"/>
-          <w:rtl w:val="0"/>
-        </w:rPr>
-        <w:t xml:space="preserve">Pourquoi la validation améliore-t-elle la qualité d’un dataset ?</w:t>
-        <w:br w:type="textWrapping"/>
-      </w:r>
-      <w:r>
-        <w:rPr>
-          <w:rFonts w:ascii="Times New Roman" w:cs="Times New Roman" w:eastAsia="Times New Roman" w:hAnsi="Times New Roman"/>
-          <w:rtl w:val="0"/>
-        </w:rPr>
-        <w:t xml:space="preserve"> Elle </w:t>
-      </w:r>
-      <w:r>
-        <w:rPr>
-          <w:rFonts w:ascii="Times New Roman" w:cs="Times New Roman" w:eastAsia="Times New Roman" w:hAnsi="Times New Roman"/>
-          <w:b w:val="1"/>
-          <w:bCs w:val="1"/>
-          <w:rtl w:val="0"/>
-        </w:rPr>
-        <w:t xml:space="preserve">réduit les erreurs de saisie</w:t>
-      </w:r>
-      <w:r>
-        <w:rPr>
-          <w:rFonts w:ascii="Times New Roman" w:cs="Times New Roman" w:eastAsia="Times New Roman" w:hAnsi="Times New Roman"/>
-          <w:rtl w:val="0"/>
-        </w:rPr>
-        <w:t xml:space="preserve"> et garantit que les données respectent certaines règles.</w:t>
+      </w:pPr>
+      <w:r>
+        <w:rPr>
+          <w:rFonts w:ascii="Times New Roman" w:cs="Times New Roman" w:eastAsia="Times New Roman" w:hAnsi="Times New Roman"/>
+          <w:rtl w:val="0"/>
+        </w:rPr>
+        <w:t xml:space="preserve">Quelle différence entre une </w:t>
+      </w:r>
+      <w:r>
+        <w:rPr>
+          <w:rFonts w:ascii="Times New Roman" w:cs="Times New Roman" w:eastAsia="Times New Roman" w:hAnsi="Times New Roman"/>
+          <w:b w:val="1"/>
+          <w:bCs w:val="1"/>
+          <w:rtl w:val="0"/>
+        </w:rPr>
+        <w:t xml:space="preserve">liste déroulante</w:t>
+      </w:r>
+      <w:r>
+        <w:rPr>
+          <w:rFonts w:ascii="Times New Roman" w:cs="Times New Roman" w:eastAsia="Times New Roman" w:hAnsi="Times New Roman"/>
+          <w:rtl w:val="0"/>
+        </w:rPr>
+        <w:t xml:space="preserve"> et une restriction numérique ?</w:t>
       </w:r>
     </w:p>
     <w:p>
@@ -246,7 +133,7 @@
           <w:ilvl w:val="0"/>
           <w:numId w:val="2"/>
         </w:numPr>
-        <w:spacing w:after="0" w:afterAutospacing="0" w:before="0" w:beforeAutospacing="0" w:lineRule="auto"/>
+        <w:spacing w:after="0" w:before="0" w:lineRule="auto"/>
         <w:ind w:left="720" w:hanging="360"/>
         <w:rPr>
           <w:rFonts w:ascii="Times New Roman" w:cs="Times New Roman" w:eastAsia="Times New Roman" w:hAnsi="Times New Roman"/>
@@ -255,78 +142,67 @@
       <w:r>
         <w:rPr>
           <w:rFonts w:ascii="Times New Roman" w:cs="Times New Roman" w:eastAsia="Times New Roman" w:hAnsi="Times New Roman"/>
-          <w:b w:val="1"/>
-          <w:bCs w:val="1"/>
-          <w:rtl w:val="0"/>
-        </w:rPr>
-        <w:t xml:space="preserve">Différence entre message d’entrée et message d’erreur :</w:t>
+          <w:rtl w:val="0"/>
+        </w:rPr>
+        <w:t xml:space="preserve">Pourquoi la validation des données améliore-t-elle la qualité d'un dataset ?</w:t>
       </w:r>
     </w:p>
     <w:p>
       <w:pPr>
         <w:numPr>
           <w:ilvl w:val="0"/>
-          <w:numId w:val="3"/>
+          <w:numId w:val="2"/>
         </w:numPr>
-        <w:spacing w:after="0" w:afterAutospacing="0" w:before="0" w:beforeAutospacing="0" w:lineRule="auto"/>
-        <w:ind w:left="1440" w:hanging="360"/>
-        <w:rPr>
-          <w:rFonts w:ascii="Times New Roman" w:cs="Times New Roman" w:eastAsia="Times New Roman" w:hAnsi="Times New Roman"/>
-        </w:rPr>
-      </w:pPr>
-      <w:r>
-        <w:rPr>
-          <w:rFonts w:ascii="Times New Roman" w:cs="Times New Roman" w:eastAsia="Times New Roman" w:hAnsi="Times New Roman"/>
-          <w:b w:val="1"/>
-          <w:bCs w:val="1"/>
-          <w:rtl w:val="0"/>
-        </w:rPr>
-        <w:t xml:space="preserve">Message d’entrée</w:t>
-      </w:r>
-      <w:r>
-        <w:rPr>
-          <w:rFonts w:ascii="Times New Roman" w:cs="Times New Roman" w:eastAsia="Times New Roman" w:hAnsi="Times New Roman"/>
-          <w:rtl w:val="0"/>
-        </w:rPr>
-        <w:t xml:space="preserve"> : donne une indication avant la saisie.</w:t>
+        <w:spacing w:after="0" w:before="0" w:lineRule="auto"/>
+        <w:ind w:left="720" w:hanging="360"/>
+      </w:pPr>
+      <w:r>
+        <w:rPr>
+          <w:rFonts w:ascii="Times New Roman" w:cs="Times New Roman" w:eastAsia="Times New Roman" w:hAnsi="Times New Roman"/>
+          <w:rtl w:val="0"/>
+        </w:rPr>
+        <w:t xml:space="preserve">Quelle différence entre un </w:t>
+      </w:r>
+      <w:r>
+        <w:rPr>
+          <w:rFonts w:ascii="Times New Roman" w:cs="Times New Roman" w:eastAsia="Times New Roman" w:hAnsi="Times New Roman"/>
+          <w:b w:val="1"/>
+          <w:bCs w:val="1"/>
+          <w:rtl w:val="0"/>
+        </w:rPr>
+        <w:t xml:space="preserve">message d'entrée</w:t>
+      </w:r>
+      <w:r>
+        <w:rPr>
+          <w:rFonts w:ascii="Times New Roman" w:cs="Times New Roman" w:eastAsia="Times New Roman" w:hAnsi="Times New Roman"/>
+          <w:rtl w:val="0"/>
+        </w:rPr>
+        <w:t xml:space="preserve"> et un </w:t>
+      </w:r>
+      <w:r>
+        <w:rPr>
+          <w:rFonts w:ascii="Times New Roman" w:cs="Times New Roman" w:eastAsia="Times New Roman" w:hAnsi="Times New Roman"/>
+          <w:b w:val="1"/>
+          <w:bCs w:val="1"/>
+          <w:rtl w:val="0"/>
+        </w:rPr>
+        <w:t xml:space="preserve">message d'erreur</w:t>
+      </w:r>
+      <w:r>
+        <w:rPr>
+          <w:rFonts w:ascii="Times New Roman" w:cs="Times New Roman" w:eastAsia="Times New Roman" w:hAnsi="Times New Roman"/>
+          <w:rtl w:val="0"/>
+        </w:rPr>
+        <w:t xml:space="preserve"> ?</w:t>
       </w:r>
     </w:p>
     <w:p>
       <w:pPr>
         <w:numPr>
           <w:ilvl w:val="0"/>
-          <w:numId w:val="3"/>
+          <w:numId w:val="2"/>
         </w:numPr>
-        <w:spacing w:after="0" w:afterAutospacing="0" w:before="0" w:beforeAutospacing="0" w:lineRule="auto"/>
-        <w:ind w:left="1440" w:hanging="360"/>
-        <w:rPr>
-          <w:rFonts w:ascii="Times New Roman" w:cs="Times New Roman" w:eastAsia="Times New Roman" w:hAnsi="Times New Roman"/>
-        </w:rPr>
-      </w:pPr>
-      <w:r>
-        <w:rPr>
-          <w:rFonts w:ascii="Times New Roman" w:cs="Times New Roman" w:eastAsia="Times New Roman" w:hAnsi="Times New Roman"/>
-          <w:b w:val="1"/>
-          <w:bCs w:val="1"/>
-          <w:rtl w:val="0"/>
-        </w:rPr>
-        <w:t xml:space="preserve">Message d’erreur</w:t>
-      </w:r>
-      <w:r>
-        <w:rPr>
-          <w:rFonts w:ascii="Times New Roman" w:cs="Times New Roman" w:eastAsia="Times New Roman" w:hAnsi="Times New Roman"/>
-          <w:rtl w:val="0"/>
-        </w:rPr>
-        <w:t xml:space="preserve"> : avertit l’utilisateur lorsqu’il saisit une valeur qui ne respecte pas la règle.</w:t>
-      </w:r>
-    </w:p>
-    <w:p>
-      <w:pPr>
-        <w:numPr>
-          <w:ilvl w:val="0"/>
-          <w:numId w:val="5"/>
-        </w:numPr>
-        <w:spacing w:after="240" w:before="0" w:beforeAutospacing="0" w:lineRule="auto"/>
+        <w:spacing w:after="0" w:before="0" w:lineRule="auto"/>
         <w:ind w:left="720" w:hanging="360"/>
         <w:rPr>
           <w:rFonts w:ascii="Times New Roman" w:cs="Times New Roman" w:eastAsia="Times New Roman" w:hAnsi="Times New Roman"/>
@@ -335,51 +211,9 @@
       <w:r>
         <w:rPr>
           <w:rFonts w:ascii="Times New Roman" w:cs="Times New Roman" w:eastAsia="Times New Roman" w:hAnsi="Times New Roman"/>
-          <w:b w:val="1"/>
-          <w:bCs w:val="1"/>
-          <w:rtl w:val="0"/>
-        </w:rPr>
-        <w:t xml:space="preserve">La validation empêche-t-elle toujours une valeur incorrecte ?</w:t>
-        <w:br w:type="textWrapping"/>
-      </w:r>
-      <w:r>
-        <w:rPr>
-          <w:rFonts w:ascii="Times New Roman" w:cs="Times New Roman" w:eastAsia="Times New Roman" w:hAnsi="Times New Roman"/>
-          <w:rtl w:val="0"/>
-        </w:rPr>
-        <w:t xml:space="preserve"> </w:t>
-      </w:r>
-      <w:r>
-        <w:rPr>
-          <w:rFonts w:ascii="Times New Roman" w:cs="Times New Roman" w:eastAsia="Times New Roman" w:hAnsi="Times New Roman"/>
-          <w:b w:val="1"/>
-          <w:bCs w:val="1"/>
-          <w:rtl w:val="0"/>
-        </w:rPr>
-        <w:t xml:space="preserve">Non.</w:t>
-      </w:r>
-      <w:r>
-        <w:rPr>
-          <w:rFonts w:ascii="Times New Roman" w:cs="Times New Roman" w:eastAsia="Times New Roman" w:hAnsi="Times New Roman"/>
-          <w:rtl w:val="0"/>
-        </w:rPr>
-        <w:t xml:space="preserve"> Cela dépend du type d’alerte choisi. Avec l’option </w:t>
-      </w:r>
-      <w:r>
-        <w:rPr>
-          <w:rFonts w:ascii="Times New Roman" w:cs="Times New Roman" w:eastAsia="Times New Roman" w:hAnsi="Times New Roman"/>
-          <w:b w:val="1"/>
-          <w:bCs w:val="1"/>
-          <w:rtl w:val="0"/>
-        </w:rPr>
-        <w:t xml:space="preserve">« Arrêt »</w:t>
-      </w:r>
-      <w:r>
-        <w:rPr>
-          <w:rFonts w:ascii="Times New Roman" w:cs="Times New Roman" w:eastAsia="Times New Roman" w:hAnsi="Times New Roman"/>
-          <w:rtl w:val="0"/>
-        </w:rPr>
-        <w:t xml:space="preserve">, Excel bloque normalement la valeur incorrecte ; avec d’autres options, il peut seulement afficher un avertissement.</w:t>
+          <w:rtl w:val="0"/>
+        </w:rPr>
+        <w:t xml:space="preserve">La validation empêche-t-elle toujours l'utilisateur de saisir une valeur incorrecte ?</w:t>
       </w:r>
     </w:p>
     <w:p>
@@ -538,7 +372,7 @@
       <w:pPr>
         <w:numPr>
           <w:ilvl w:val="0"/>
-          <w:numId w:val="11"/>
+          <w:numId w:val="7"/>
         </w:numPr>
         <w:spacing w:after="0" w:before="0" w:lineRule="auto"/>
         <w:ind w:left="720" w:hanging="360"/>
@@ -559,7 +393,7 @@
       <w:pPr>
         <w:numPr>
           <w:ilvl w:val="0"/>
-          <w:numId w:val="11"/>
+          <w:numId w:val="7"/>
         </w:numPr>
         <w:spacing w:after="0" w:before="0" w:lineRule="auto"/>
         <w:ind w:left="720" w:hanging="360"/>
@@ -580,7 +414,7 @@
       <w:pPr>
         <w:numPr>
           <w:ilvl w:val="0"/>
-          <w:numId w:val="11"/>
+          <w:numId w:val="7"/>
         </w:numPr>
         <w:spacing w:after="0" w:before="0" w:lineRule="auto"/>
         <w:ind w:left="720" w:hanging="360"/>
@@ -601,7 +435,7 @@
       <w:pPr>
         <w:numPr>
           <w:ilvl w:val="0"/>
-          <w:numId w:val="11"/>
+          <w:numId w:val="7"/>
         </w:numPr>
         <w:spacing w:after="0" w:before="0" w:lineRule="auto"/>
         <w:ind w:left="720" w:hanging="360"/>
@@ -669,34 +503,14 @@
         <w:ind w:left="600" w:right="600" w:firstLine="0"/>
         <w:rPr>
           <w:rFonts w:ascii="Times New Roman" w:cs="Times New Roman" w:eastAsia="Times New Roman" w:hAnsi="Times New Roman"/>
-          <w:b w:val="1"/>
-          <w:bCs w:val="1"/>
-        </w:rPr>
-      </w:pPr>
-      <w:r>
-        <w:rPr>
-          <w:rFonts w:ascii="Times New Roman" w:cs="Times New Roman" w:eastAsia="Times New Roman" w:hAnsi="Times New Roman"/>
-          <w:b w:val="1"/>
-          <w:bCs w:val="1"/>
+        </w:rPr>
+      </w:pPr>
+      <w:r>
+        <w:rPr>
+          <w:rFonts w:ascii="Times New Roman" w:cs="Times New Roman" w:eastAsia="Times New Roman" w:hAnsi="Times New Roman"/>
           <w:rtl w:val="0"/>
         </w:rPr>
         <w:t xml:space="preserve">Que se passe-t-il lorsqu'une valeur non autorisée est saisie ?</w:t>
-      </w:r>
-    </w:p>
-    <w:p>
-      <w:pPr>
-        <w:spacing w:after="0" w:before="0" w:lineRule="auto"/>
-        <w:ind w:left="600" w:right="600" w:firstLine="0"/>
-        <w:rPr>
-          <w:rFonts w:ascii="Times New Roman" w:cs="Times New Roman" w:eastAsia="Times New Roman" w:hAnsi="Times New Roman"/>
-        </w:rPr>
-      </w:pPr>
-      <w:r>
-        <w:rPr>
-          <w:rFonts w:ascii="Times New Roman" w:cs="Times New Roman" w:eastAsia="Times New Roman" w:hAnsi="Times New Roman"/>
-          <w:rtl w:val="0"/>
-        </w:rPr>
-        <w:t xml:space="preserve">Excel renvoie une erreur disant qu’on a applique une regle de validation des donnees.</w:t>
       </w:r>
     </w:p>
     <w:p>
@@ -1957,7 +1771,7 @@
       <w:pPr>
         <w:numPr>
           <w:ilvl w:val="0"/>
-          <w:numId w:val="9"/>
+          <w:numId w:val="5"/>
         </w:numPr>
         <w:spacing w:after="0" w:before="0" w:lineRule="auto"/>
         <w:ind w:left="720" w:hanging="360"/>
@@ -1978,7 +1792,7 @@
       <w:pPr>
         <w:numPr>
           <w:ilvl w:val="0"/>
-          <w:numId w:val="9"/>
+          <w:numId w:val="5"/>
         </w:numPr>
         <w:spacing w:after="0" w:before="0" w:lineRule="auto"/>
         <w:ind w:left="720" w:hanging="360"/>
@@ -2018,7 +1832,7 @@
       <w:pPr>
         <w:numPr>
           <w:ilvl w:val="0"/>
-          <w:numId w:val="7"/>
+          <w:numId w:val="4"/>
         </w:numPr>
         <w:spacing w:after="0" w:before="0" w:lineRule="auto"/>
         <w:ind w:left="720" w:hanging="360"/>
@@ -2039,7 +1853,7 @@
       <w:pPr>
         <w:numPr>
           <w:ilvl w:val="0"/>
-          <w:numId w:val="7"/>
+          <w:numId w:val="4"/>
         </w:numPr>
         <w:spacing w:after="0" w:before="0" w:lineRule="auto"/>
         <w:ind w:left="720" w:hanging="360"/>
@@ -2060,7 +1874,7 @@
       <w:pPr>
         <w:numPr>
           <w:ilvl w:val="0"/>
-          <w:numId w:val="7"/>
+          <w:numId w:val="4"/>
         </w:numPr>
         <w:spacing w:after="0" w:before="0" w:lineRule="auto"/>
         <w:ind w:left="720" w:hanging="360"/>
@@ -2081,7 +1895,7 @@
       <w:pPr>
         <w:numPr>
           <w:ilvl w:val="0"/>
-          <w:numId w:val="7"/>
+          <w:numId w:val="4"/>
         </w:numPr>
         <w:spacing w:after="0" w:before="0" w:lineRule="auto"/>
         <w:ind w:left="720" w:hanging="360"/>
@@ -2102,7 +1916,7 @@
       <w:pPr>
         <w:numPr>
           <w:ilvl w:val="0"/>
-          <w:numId w:val="7"/>
+          <w:numId w:val="4"/>
         </w:numPr>
         <w:spacing w:after="0" w:before="0" w:lineRule="auto"/>
         <w:ind w:left="720" w:hanging="360"/>
@@ -2123,7 +1937,7 @@
       <w:pPr>
         <w:numPr>
           <w:ilvl w:val="0"/>
-          <w:numId w:val="7"/>
+          <w:numId w:val="4"/>
         </w:numPr>
         <w:spacing w:after="0" w:before="0" w:lineRule="auto"/>
         <w:ind w:left="720" w:hanging="360"/>
@@ -2157,6 +1971,109 @@
           <w:rtl w:val="0"/>
         </w:rPr>
         <w:t xml:space="preserve">Filière :</w:t>
+      </w:r>
+    </w:p>
+    <w:p>
+      <w:pPr>
+        <w:numPr>
+          <w:ilvl w:val="0"/>
+          <w:numId w:val="3"/>
+        </w:numPr>
+        <w:spacing w:after="0" w:before="0" w:lineRule="auto"/>
+        <w:ind w:left="720" w:hanging="360"/>
+        <w:rPr>
+          <w:rFonts w:ascii="Times New Roman" w:cs="Times New Roman" w:eastAsia="Times New Roman" w:hAnsi="Times New Roman"/>
+          <w:u w:val="none"/>
+        </w:rPr>
+      </w:pPr>
+      <w:r>
+        <w:rPr>
+          <w:rFonts w:ascii="Times New Roman" w:cs="Times New Roman" w:eastAsia="Times New Roman" w:hAnsi="Times New Roman"/>
+          <w:rtl w:val="0"/>
+        </w:rPr>
+        <w:t xml:space="preserve">Data</w:t>
+      </w:r>
+    </w:p>
+    <w:p>
+      <w:pPr>
+        <w:numPr>
+          <w:ilvl w:val="0"/>
+          <w:numId w:val="3"/>
+        </w:numPr>
+        <w:spacing w:after="0" w:before="0" w:lineRule="auto"/>
+        <w:ind w:left="720" w:hanging="360"/>
+        <w:rPr>
+          <w:rFonts w:ascii="Times New Roman" w:cs="Times New Roman" w:eastAsia="Times New Roman" w:hAnsi="Times New Roman"/>
+          <w:u w:val="none"/>
+        </w:rPr>
+      </w:pPr>
+      <w:r>
+        <w:rPr>
+          <w:rFonts w:ascii="Times New Roman" w:cs="Times New Roman" w:eastAsia="Times New Roman" w:hAnsi="Times New Roman"/>
+          <w:rtl w:val="0"/>
+        </w:rPr>
+        <w:t xml:space="preserve">Développement</w:t>
+      </w:r>
+    </w:p>
+    <w:p>
+      <w:pPr>
+        <w:numPr>
+          <w:ilvl w:val="0"/>
+          <w:numId w:val="3"/>
+        </w:numPr>
+        <w:spacing w:after="0" w:before="0" w:lineRule="auto"/>
+        <w:ind w:left="720" w:hanging="360"/>
+        <w:rPr>
+          <w:rFonts w:ascii="Times New Roman" w:cs="Times New Roman" w:eastAsia="Times New Roman" w:hAnsi="Times New Roman"/>
+          <w:u w:val="none"/>
+        </w:rPr>
+      </w:pPr>
+      <w:r>
+        <w:rPr>
+          <w:rFonts w:ascii="Times New Roman" w:cs="Times New Roman" w:eastAsia="Times New Roman" w:hAnsi="Times New Roman"/>
+          <w:rtl w:val="0"/>
+        </w:rPr>
+        <w:t xml:space="preserve">Cybersécurité</w:t>
+      </w:r>
+    </w:p>
+    <w:p>
+      <w:pPr>
+        <w:numPr>
+          <w:ilvl w:val="0"/>
+          <w:numId w:val="3"/>
+        </w:numPr>
+        <w:spacing w:after="0" w:before="0" w:lineRule="auto"/>
+        <w:ind w:left="720" w:hanging="360"/>
+        <w:rPr>
+          <w:rFonts w:ascii="Times New Roman" w:cs="Times New Roman" w:eastAsia="Times New Roman" w:hAnsi="Times New Roman"/>
+          <w:u w:val="none"/>
+        </w:rPr>
+      </w:pPr>
+      <w:r>
+        <w:rPr>
+          <w:rFonts w:ascii="Times New Roman" w:cs="Times New Roman" w:eastAsia="Times New Roman" w:hAnsi="Times New Roman"/>
+          <w:rtl w:val="0"/>
+        </w:rPr>
+        <w:t xml:space="preserve">IA</w:t>
+      </w:r>
+    </w:p>
+    <w:p>
+      <w:pPr>
+        <w:spacing w:after="0" w:before="0" w:lineRule="auto"/>
+        <w:rPr>
+          <w:rFonts w:ascii="Times New Roman" w:cs="Times New Roman" w:eastAsia="Times New Roman" w:hAnsi="Times New Roman"/>
+          <w:b w:val="1"/>
+          <w:bCs w:val="1"/>
+        </w:rPr>
+      </w:pPr>
+      <w:r>
+        <w:rPr>
+          <w:rFonts w:ascii="Times New Roman" w:cs="Times New Roman" w:eastAsia="Times New Roman" w:hAnsi="Times New Roman"/>
+          <w:b w:val="1"/>
+          <w:bCs w:val="1"/>
+          <w:rtl w:val="0"/>
+        </w:rPr>
+        <w:t xml:space="preserve">Niveau :</w:t>
       </w:r>
     </w:p>
     <w:p>
@@ -2177,7 +2094,7 @@
           <w:rFonts w:ascii="Times New Roman" w:cs="Times New Roman" w:eastAsia="Times New Roman" w:hAnsi="Times New Roman"/>
           <w:rtl w:val="0"/>
         </w:rPr>
-        <w:t xml:space="preserve">Data</w:t>
+        <w:t xml:space="preserve">Débutant</w:t>
       </w:r>
     </w:p>
     <w:p>
@@ -2198,7 +2115,7 @@
           <w:rFonts w:ascii="Times New Roman" w:cs="Times New Roman" w:eastAsia="Times New Roman" w:hAnsi="Times New Roman"/>
           <w:rtl w:val="0"/>
         </w:rPr>
-        <w:t xml:space="preserve">Développement</w:t>
+        <w:t xml:space="preserve">Intermédiaire</w:t>
       </w:r>
     </w:p>
     <w:p>
@@ -2206,109 +2123,6 @@
         <w:numPr>
           <w:ilvl w:val="0"/>
           <w:numId w:val="6"/>
-        </w:numPr>
-        <w:spacing w:after="0" w:before="0" w:lineRule="auto"/>
-        <w:ind w:left="720" w:hanging="360"/>
-        <w:rPr>
-          <w:rFonts w:ascii="Times New Roman" w:cs="Times New Roman" w:eastAsia="Times New Roman" w:hAnsi="Times New Roman"/>
-          <w:u w:val="none"/>
-        </w:rPr>
-      </w:pPr>
-      <w:r>
-        <w:rPr>
-          <w:rFonts w:ascii="Times New Roman" w:cs="Times New Roman" w:eastAsia="Times New Roman" w:hAnsi="Times New Roman"/>
-          <w:rtl w:val="0"/>
-        </w:rPr>
-        <w:t xml:space="preserve">Cybersécurité</w:t>
-      </w:r>
-    </w:p>
-    <w:p>
-      <w:pPr>
-        <w:numPr>
-          <w:ilvl w:val="0"/>
-          <w:numId w:val="6"/>
-        </w:numPr>
-        <w:spacing w:after="0" w:before="0" w:lineRule="auto"/>
-        <w:ind w:left="720" w:hanging="360"/>
-        <w:rPr>
-          <w:rFonts w:ascii="Times New Roman" w:cs="Times New Roman" w:eastAsia="Times New Roman" w:hAnsi="Times New Roman"/>
-          <w:u w:val="none"/>
-        </w:rPr>
-      </w:pPr>
-      <w:r>
-        <w:rPr>
-          <w:rFonts w:ascii="Times New Roman" w:cs="Times New Roman" w:eastAsia="Times New Roman" w:hAnsi="Times New Roman"/>
-          <w:rtl w:val="0"/>
-        </w:rPr>
-        <w:t xml:space="preserve">IA</w:t>
-      </w:r>
-    </w:p>
-    <w:p>
-      <w:pPr>
-        <w:spacing w:after="0" w:before="0" w:lineRule="auto"/>
-        <w:rPr>
-          <w:rFonts w:ascii="Times New Roman" w:cs="Times New Roman" w:eastAsia="Times New Roman" w:hAnsi="Times New Roman"/>
-          <w:b w:val="1"/>
-          <w:bCs w:val="1"/>
-        </w:rPr>
-      </w:pPr>
-      <w:r>
-        <w:rPr>
-          <w:rFonts w:ascii="Times New Roman" w:cs="Times New Roman" w:eastAsia="Times New Roman" w:hAnsi="Times New Roman"/>
-          <w:b w:val="1"/>
-          <w:bCs w:val="1"/>
-          <w:rtl w:val="0"/>
-        </w:rPr>
-        <w:t xml:space="preserve">Niveau :</w:t>
-      </w:r>
-    </w:p>
-    <w:p>
-      <w:pPr>
-        <w:numPr>
-          <w:ilvl w:val="0"/>
-          <w:numId w:val="10"/>
-        </w:numPr>
-        <w:spacing w:after="0" w:before="0" w:lineRule="auto"/>
-        <w:ind w:left="720" w:hanging="360"/>
-        <w:rPr>
-          <w:rFonts w:ascii="Times New Roman" w:cs="Times New Roman" w:eastAsia="Times New Roman" w:hAnsi="Times New Roman"/>
-          <w:u w:val="none"/>
-        </w:rPr>
-      </w:pPr>
-      <w:r>
-        <w:rPr>
-          <w:rFonts w:ascii="Times New Roman" w:cs="Times New Roman" w:eastAsia="Times New Roman" w:hAnsi="Times New Roman"/>
-          <w:rtl w:val="0"/>
-        </w:rPr>
-        <w:t xml:space="preserve">Débutant</w:t>
-      </w:r>
-    </w:p>
-    <w:p>
-      <w:pPr>
-        <w:numPr>
-          <w:ilvl w:val="0"/>
-          <w:numId w:val="10"/>
-        </w:numPr>
-        <w:spacing w:after="0" w:before="0" w:lineRule="auto"/>
-        <w:ind w:left="720" w:hanging="360"/>
-        <w:rPr>
-          <w:rFonts w:ascii="Times New Roman" w:cs="Times New Roman" w:eastAsia="Times New Roman" w:hAnsi="Times New Roman"/>
-          <w:u w:val="none"/>
-        </w:rPr>
-      </w:pPr>
-      <w:r>
-        <w:rPr>
-          <w:rFonts w:ascii="Times New Roman" w:cs="Times New Roman" w:eastAsia="Times New Roman" w:hAnsi="Times New Roman"/>
-          <w:rtl w:val="0"/>
-        </w:rPr>
-        <w:t xml:space="preserve">Intermédiaire</w:t>
-      </w:r>
-    </w:p>
-    <w:p>
-      <w:pPr>
-        <w:numPr>
-          <w:ilvl w:val="0"/>
-          <w:numId w:val="10"/>
         </w:numPr>
         <w:spacing w:after="0" w:before="0" w:lineRule="auto"/>
         <w:ind w:left="720" w:hanging="360"/>
@@ -2450,7 +2264,7 @@
   </w:abstractNum>
   <w:abstractNum w:abstractNumId="2">
     <w:lvl w:ilvl="0">
-      <w:start w:val="3"/>
+      <w:start w:val="1"/>
       <w:numFmt w:val="decimal"/>
       <w:lvlText w:val="%1."/>
       <w:lvlJc w:val="left"/>
@@ -2565,103 +2379,105 @@
       <w:lvlText w:val="●"/>
       <w:lvlJc w:val="left"/>
       <w:pPr>
+        <w:ind w:left="720" w:hanging="360"/>
+      </w:pPr>
+      <w:rPr>
+        <w:sz w:val="14"/>
+        <w:szCs w:val="14"/>
+        <w:u w:val="none"/>
+      </w:rPr>
+    </w:lvl>
+    <w:lvl w:ilvl="1">
+      <w:start w:val="1"/>
+      <w:numFmt w:val="bullet"/>
+      <w:lvlText w:val="○"/>
+      <w:lvlJc w:val="left"/>
+      <w:pPr>
         <w:ind w:left="1440" w:hanging="360"/>
       </w:pPr>
       <w:rPr>
         <w:u w:val="none"/>
       </w:rPr>
     </w:lvl>
-    <w:lvl w:ilvl="1">
+    <w:lvl w:ilvl="2">
+      <w:start w:val="1"/>
+      <w:numFmt w:val="bullet"/>
+      <w:lvlText w:val="■"/>
+      <w:lvlJc w:val="left"/>
+      <w:pPr>
+        <w:ind w:left="2160" w:hanging="360"/>
+      </w:pPr>
+      <w:rPr>
+        <w:u w:val="none"/>
+      </w:rPr>
+    </w:lvl>
+    <w:lvl w:ilvl="3">
+      <w:start w:val="1"/>
+      <w:numFmt w:val="bullet"/>
+      <w:lvlText w:val="●"/>
+      <w:lvlJc w:val="left"/>
+      <w:pPr>
+        <w:ind w:left="2880" w:hanging="360"/>
+      </w:pPr>
+      <w:rPr>
+        <w:u w:val="none"/>
+      </w:rPr>
+    </w:lvl>
+    <w:lvl w:ilvl="4">
       <w:start w:val="1"/>
       <w:numFmt w:val="bullet"/>
       <w:lvlText w:val="○"/>
       <w:lvlJc w:val="left"/>
       <w:pPr>
-        <w:ind w:left="2160" w:hanging="360"/>
-      </w:pPr>
-      <w:rPr>
-        <w:u w:val="none"/>
-      </w:rPr>
-    </w:lvl>
-    <w:lvl w:ilvl="2">
+        <w:ind w:left="3600" w:hanging="360"/>
+      </w:pPr>
+      <w:rPr>
+        <w:u w:val="none"/>
+      </w:rPr>
+    </w:lvl>
+    <w:lvl w:ilvl="5">
       <w:start w:val="1"/>
       <w:numFmt w:val="bullet"/>
       <w:lvlText w:val="■"/>
       <w:lvlJc w:val="left"/>
       <w:pPr>
-        <w:ind w:left="2880" w:hanging="360"/>
-      </w:pPr>
-      <w:rPr>
-        <w:u w:val="none"/>
-      </w:rPr>
-    </w:lvl>
-    <w:lvl w:ilvl="3">
+        <w:ind w:left="4320" w:hanging="360"/>
+      </w:pPr>
+      <w:rPr>
+        <w:u w:val="none"/>
+      </w:rPr>
+    </w:lvl>
+    <w:lvl w:ilvl="6">
       <w:start w:val="1"/>
       <w:numFmt w:val="bullet"/>
       <w:lvlText w:val="●"/>
       <w:lvlJc w:val="left"/>
       <w:pPr>
-        <w:ind w:left="3600" w:hanging="360"/>
-      </w:pPr>
-      <w:rPr>
-        <w:u w:val="none"/>
-      </w:rPr>
-    </w:lvl>
-    <w:lvl w:ilvl="4">
+        <w:ind w:left="5040" w:hanging="360"/>
+      </w:pPr>
+      <w:rPr>
+        <w:u w:val="none"/>
+      </w:rPr>
+    </w:lvl>
+    <w:lvl w:ilvl="7">
       <w:start w:val="1"/>
       <w:numFmt w:val="bullet"/>
       <w:lvlText w:val="○"/>
       <w:lvlJc w:val="left"/>
       <w:pPr>
-        <w:ind w:left="4320" w:hanging="360"/>
-      </w:pPr>
-      <w:rPr>
-        <w:u w:val="none"/>
-      </w:rPr>
-    </w:lvl>
-    <w:lvl w:ilvl="5">
+        <w:ind w:left="5760" w:hanging="360"/>
+      </w:pPr>
+      <w:rPr>
+        <w:u w:val="none"/>
+      </w:rPr>
+    </w:lvl>
+    <w:lvl w:ilvl="8">
       <w:start w:val="1"/>
       <w:numFmt w:val="bullet"/>
       <w:lvlText w:val="■"/>
       <w:lvlJc w:val="left"/>
       <w:pPr>
-        <w:ind w:left="5040" w:hanging="360"/>
-      </w:pPr>
-      <w:rPr>
-        <w:u w:val="none"/>
-      </w:rPr>
-    </w:lvl>
-    <w:lvl w:ilvl="6">
-      <w:start w:val="1"/>
-      <w:numFmt w:val="bullet"/>
-      <w:lvlText w:val="●"/>
-      <w:lvlJc w:val="left"/>
-      <w:pPr>
-        <w:ind w:left="5760" w:hanging="360"/>
-      </w:pPr>
-      <w:rPr>
-        <w:u w:val="none"/>
-      </w:rPr>
-    </w:lvl>
-    <w:lvl w:ilvl="7">
-      <w:start w:val="1"/>
-      <w:numFmt w:val="bullet"/>
-      <w:lvlText w:val="○"/>
-      <w:lvlJc w:val="left"/>
-      <w:pPr>
         <w:ind w:left="6480" w:hanging="360"/>
-      </w:pPr>
-      <w:rPr>
-        <w:u w:val="none"/>
-      </w:rPr>
-    </w:lvl>
-    <w:lvl w:ilvl="8">
-      <w:start w:val="1"/>
-      <w:numFmt w:val="bullet"/>
-      <w:lvlText w:val="■"/>
-      <w:lvlJc w:val="left"/>
-      <w:pPr>
-        <w:ind w:left="7200" w:hanging="360"/>
       </w:pPr>
       <w:rPr>
         <w:u w:val="none"/>
@@ -2671,20 +2487,22 @@
   <w:abstractNum w:abstractNumId="4">
     <w:lvl w:ilvl="0">
       <w:start w:val="1"/>
-      <w:numFmt w:val="decimal"/>
-      <w:lvlText w:val="%1."/>
+      <w:numFmt w:val="bullet"/>
+      <w:lvlText w:val="●"/>
       <w:lvlJc w:val="left"/>
       <w:pPr>
         <w:ind w:left="720" w:hanging="360"/>
       </w:pPr>
       <w:rPr>
+        <w:sz w:val="14"/>
+        <w:szCs w:val="14"/>
         <w:u w:val="none"/>
       </w:rPr>
     </w:lvl>
     <w:lvl w:ilvl="1">
       <w:start w:val="1"/>
-      <w:numFmt w:val="lowerLetter"/>
-      <w:lvlText w:val="%2."/>
+      <w:numFmt w:val="bullet"/>
+      <w:lvlText w:val="○"/>
       <w:lvlJc w:val="left"/>
       <w:pPr>
         <w:ind w:left="1440" w:hanging="360"/>
@@ -2695,8 +2513,8 @@
     </w:lvl>
     <w:lvl w:ilvl="2">
       <w:start w:val="1"/>
-      <w:numFmt w:val="lowerRoman"/>
-      <w:lvlText w:val="%3."/>
+      <w:numFmt w:val="bullet"/>
+      <w:lvlText w:val="■"/>
       <w:lvlJc w:val="left"/>
       <w:pPr>
         <w:ind w:left="2160" w:hanging="360"/>
@@ -2707,8 +2525,8 @@
     </w:lvl>
     <w:lvl w:ilvl="3">
       <w:start w:val="1"/>
-      <w:numFmt w:val="decimal"/>
-      <w:lvlText w:val="%4."/>
+      <w:numFmt w:val="bullet"/>
+      <w:lvlText w:val="●"/>
       <w:lvlJc w:val="left"/>
       <w:pPr>
         <w:ind w:left="2880" w:hanging="360"/>
@@ -2719,8 +2537,8 @@
     </w:lvl>
     <w:lvl w:ilvl="4">
       <w:start w:val="1"/>
-      <w:numFmt w:val="lowerLetter"/>
-      <w:lvlText w:val="%5."/>
+      <w:numFmt w:val="bullet"/>
+      <w:lvlText w:val="○"/>
       <w:lvlJc w:val="left"/>
       <w:pPr>
         <w:ind w:left="3600" w:hanging="360"/>
@@ -2731,8 +2549,8 @@
     </w:lvl>
     <w:lvl w:ilvl="5">
       <w:start w:val="1"/>
-      <w:numFmt w:val="lowerRoman"/>
-      <w:lvlText w:val="%6."/>
+      <w:numFmt w:val="bullet"/>
+      <w:lvlText w:val="■"/>
       <w:lvlJc w:val="left"/>
       <w:pPr>
         <w:ind w:left="4320" w:hanging="360"/>
@@ -2743,8 +2561,8 @@
     </w:lvl>
     <w:lvl w:ilvl="6">
       <w:start w:val="1"/>
-      <w:numFmt w:val="decimal"/>
-      <w:lvlText w:val="%7."/>
+      <w:numFmt w:val="bullet"/>
+      <w:lvlText w:val="●"/>
       <w:lvlJc w:val="left"/>
       <w:pPr>
         <w:ind w:left="5040" w:hanging="360"/>
@@ -2755,8 +2573,8 @@
     </w:lvl>
     <w:lvl w:ilvl="7">
       <w:start w:val="1"/>
-      <w:numFmt w:val="lowerLetter"/>
-      <w:lvlText w:val="%8."/>
+      <w:numFmt w:val="bullet"/>
+      <w:lvlText w:val="○"/>
       <w:lvlJc w:val="left"/>
       <w:pPr>
         <w:ind w:left="5760" w:hanging="360"/>
@@ -2767,8 +2585,8 @@
     </w:lvl>
     <w:lvl w:ilvl="8">
       <w:start w:val="1"/>
-      <w:numFmt w:val="lowerRoman"/>
-      <w:lvlText w:val="%9."/>
+      <w:numFmt w:val="bullet"/>
+      <w:lvlText w:val="■"/>
       <w:lvlJc w:val="left"/>
       <w:pPr>
         <w:ind w:left="6480" w:hanging="360"/>
@@ -2780,21 +2598,23 @@
   </w:abstractNum>
   <w:abstractNum w:abstractNumId="5">
     <w:lvl w:ilvl="0">
-      <w:start w:val="5"/>
-      <w:numFmt w:val="decimal"/>
-      <w:lvlText w:val="%1."/>
+      <w:start w:val="1"/>
+      <w:numFmt w:val="bullet"/>
+      <w:lvlText w:val="●"/>
       <w:lvlJc w:val="left"/>
       <w:pPr>
         <w:ind w:left="720" w:hanging="360"/>
       </w:pPr>
       <w:rPr>
+        <w:sz w:val="14"/>
+        <w:szCs w:val="14"/>
         <w:u w:val="none"/>
       </w:rPr>
     </w:lvl>
     <w:lvl w:ilvl="1">
       <w:start w:val="1"/>
-      <w:numFmt w:val="lowerLetter"/>
-      <w:lvlText w:val="%2."/>
+      <w:numFmt w:val="bullet"/>
+      <w:lvlText w:val="○"/>
       <w:lvlJc w:val="left"/>
       <w:pPr>
         <w:ind w:left="1440" w:hanging="360"/>
@@ -2805,8 +2625,8 @@
     </w:lvl>
     <w:lvl w:ilvl="2">
       <w:start w:val="1"/>
-      <w:numFmt w:val="lowerRoman"/>
-      <w:lvlText w:val="%3."/>
+      <w:numFmt w:val="bullet"/>
+      <w:lvlText w:val="■"/>
       <w:lvlJc w:val="left"/>
       <w:pPr>
         <w:ind w:left="2160" w:hanging="360"/>
@@ -2817,8 +2637,8 @@
     </w:lvl>
     <w:lvl w:ilvl="3">
       <w:start w:val="1"/>
-      <w:numFmt w:val="decimal"/>
-      <w:lvlText w:val="%4."/>
+      <w:numFmt w:val="bullet"/>
+      <w:lvlText w:val="●"/>
       <w:lvlJc w:val="left"/>
       <w:pPr>
         <w:ind w:left="2880" w:hanging="360"/>
@@ -2829,8 +2649,8 @@
     </w:lvl>
     <w:lvl w:ilvl="4">
       <w:start w:val="1"/>
-      <w:numFmt w:val="lowerLetter"/>
-      <w:lvlText w:val="%5."/>
+      <w:numFmt w:val="bullet"/>
+      <w:lvlText w:val="○"/>
       <w:lvlJc w:val="left"/>
       <w:pPr>
         <w:ind w:left="3600" w:hanging="360"/>
@@ -2841,8 +2661,8 @@
     </w:lvl>
     <w:lvl w:ilvl="5">
       <w:start w:val="1"/>
-      <w:numFmt w:val="lowerRoman"/>
-      <w:lvlText w:val="%6."/>
+      <w:numFmt w:val="bullet"/>
+      <w:lvlText w:val="■"/>
       <w:lvlJc w:val="left"/>
       <w:pPr>
         <w:ind w:left="4320" w:hanging="360"/>
@@ -2853,8 +2673,8 @@
     </w:lvl>
     <w:lvl w:ilvl="6">
       <w:start w:val="1"/>
-      <w:numFmt w:val="decimal"/>
-      <w:lvlText w:val="%7."/>
+      <w:numFmt w:val="bullet"/>
+      <w:lvlText w:val="●"/>
       <w:lvlJc w:val="left"/>
       <w:pPr>
         <w:ind w:left="5040" w:hanging="360"/>
@@ -2865,8 +2685,8 @@
     </w:lvl>
     <w:lvl w:ilvl="7">
       <w:start w:val="1"/>
-      <w:numFmt w:val="lowerLetter"/>
-      <w:lvlText w:val="%8."/>
+      <w:numFmt w:val="bullet"/>
+      <w:lvlText w:val="○"/>
       <w:lvlJc w:val="left"/>
       <w:pPr>
         <w:ind w:left="5760" w:hanging="360"/>
@@ -2877,8 +2697,8 @@
     </w:lvl>
     <w:lvl w:ilvl="8">
       <w:start w:val="1"/>
-      <w:numFmt w:val="lowerRoman"/>
-      <w:lvlText w:val="%9."/>
+      <w:numFmt w:val="bullet"/>
+      <w:lvlText w:val="■"/>
       <w:lvlJc w:val="left"/>
       <w:pPr>
         <w:ind w:left="6480" w:hanging="360"/>
@@ -3001,452 +2821,6 @@
     </w:lvl>
   </w:abstractNum>
   <w:abstractNum w:abstractNumId="7">
-    <w:lvl w:ilvl="0">
-      <w:start w:val="1"/>
-      <w:numFmt w:val="bullet"/>
-      <w:lvlText w:val="●"/>
-      <w:lvlJc w:val="left"/>
-      <w:pPr>
-        <w:ind w:left="720" w:hanging="360"/>
-      </w:pPr>
-      <w:rPr>
-        <w:sz w:val="14"/>
-        <w:szCs w:val="14"/>
-        <w:u w:val="none"/>
-      </w:rPr>
-    </w:lvl>
-    <w:lvl w:ilvl="1">
-      <w:start w:val="1"/>
-      <w:numFmt w:val="bullet"/>
-      <w:lvlText w:val="○"/>
-      <w:lvlJc w:val="left"/>
-      <w:pPr>
-        <w:ind w:left="1440" w:hanging="360"/>
-      </w:pPr>
-      <w:rPr>
-        <w:u w:val="none"/>
-      </w:rPr>
-    </w:lvl>
-    <w:lvl w:ilvl="2">
-      <w:start w:val="1"/>
-      <w:numFmt w:val="bullet"/>
-      <w:lvlText w:val="■"/>
-      <w:lvlJc w:val="left"/>
-      <w:pPr>
-        <w:ind w:left="2160" w:hanging="360"/>
-      </w:pPr>
-      <w:rPr>
-        <w:u w:val="none"/>
-      </w:rPr>
-    </w:lvl>
-    <w:lvl w:ilvl="3">
-      <w:start w:val="1"/>
-      <w:numFmt w:val="bullet"/>
-      <w:lvlText w:val="●"/>
-      <w:lvlJc w:val="left"/>
-      <w:pPr>
-        <w:ind w:left="2880" w:hanging="360"/>
-      </w:pPr>
-      <w:rPr>
-        <w:u w:val="none"/>
-      </w:rPr>
-    </w:lvl>
-    <w:lvl w:ilvl="4">
-      <w:start w:val="1"/>
-      <w:numFmt w:val="bullet"/>
-      <w:lvlText w:val="○"/>
-      <w:lvlJc w:val="left"/>
-      <w:pPr>
-        <w:ind w:left="3600" w:hanging="360"/>
-      </w:pPr>
-      <w:rPr>
-        <w:u w:val="none"/>
-      </w:rPr>
-    </w:lvl>
-    <w:lvl w:ilvl="5">
-      <w:start w:val="1"/>
-      <w:numFmt w:val="bullet"/>
-      <w:lvlText w:val="■"/>
-      <w:lvlJc w:val="left"/>
-      <w:pPr>
-        <w:ind w:left="4320" w:hanging="360"/>
-      </w:pPr>
-      <w:rPr>
-        <w:u w:val="none"/>
-      </w:rPr>
-    </w:lvl>
-    <w:lvl w:ilvl="6">
-      <w:start w:val="1"/>
-      <w:numFmt w:val="bullet"/>
-      <w:lvlText w:val="●"/>
-      <w:lvlJc w:val="left"/>
-      <w:pPr>
-        <w:ind w:left="5040" w:hanging="360"/>
-      </w:pPr>
-      <w:rPr>
-        <w:u w:val="none"/>
-      </w:rPr>
-    </w:lvl>
-    <w:lvl w:ilvl="7">
-      <w:start w:val="1"/>
-      <w:numFmt w:val="bullet"/>
-      <w:lvlText w:val="○"/>
-      <w:lvlJc w:val="left"/>
-      <w:pPr>
-        <w:ind w:left="5760" w:hanging="360"/>
-      </w:pPr>
-      <w:rPr>
-        <w:u w:val="none"/>
-      </w:rPr>
-    </w:lvl>
-    <w:lvl w:ilvl="8">
-      <w:start w:val="1"/>
-      <w:numFmt w:val="bullet"/>
-      <w:lvlText w:val="■"/>
-      <w:lvlJc w:val="left"/>
-      <w:pPr>
-        <w:ind w:left="6480" w:hanging="360"/>
-      </w:pPr>
-      <w:rPr>
-        <w:u w:val="none"/>
-      </w:rPr>
-    </w:lvl>
-  </w:abstractNum>
-  <w:abstractNum w:abstractNumId="8">
-    <w:lvl w:ilvl="0">
-      <w:start w:val="1"/>
-      <w:numFmt w:val="bullet"/>
-      <w:lvlText w:val="●"/>
-      <w:lvlJc w:val="left"/>
-      <w:pPr>
-        <w:ind w:left="720" w:hanging="360"/>
-      </w:pPr>
-      <w:rPr>
-        <w:u w:val="none"/>
-      </w:rPr>
-    </w:lvl>
-    <w:lvl w:ilvl="1">
-      <w:start w:val="1"/>
-      <w:numFmt w:val="bullet"/>
-      <w:lvlText w:val="○"/>
-      <w:lvlJc w:val="left"/>
-      <w:pPr>
-        <w:ind w:left="1440" w:hanging="360"/>
-      </w:pPr>
-      <w:rPr>
-        <w:u w:val="none"/>
-      </w:rPr>
-    </w:lvl>
-    <w:lvl w:ilvl="2">
-      <w:start w:val="1"/>
-      <w:numFmt w:val="bullet"/>
-      <w:lvlText w:val="■"/>
-      <w:lvlJc w:val="left"/>
-      <w:pPr>
-        <w:ind w:left="2160" w:hanging="360"/>
-      </w:pPr>
-      <w:rPr>
-        <w:u w:val="none"/>
-      </w:rPr>
-    </w:lvl>
-    <w:lvl w:ilvl="3">
-      <w:start w:val="1"/>
-      <w:numFmt w:val="bullet"/>
-      <w:lvlText w:val="●"/>
-      <w:lvlJc w:val="left"/>
-      <w:pPr>
-        <w:ind w:left="2880" w:hanging="360"/>
-      </w:pPr>
-      <w:rPr>
-        <w:u w:val="none"/>
-      </w:rPr>
-    </w:lvl>
-    <w:lvl w:ilvl="4">
-      <w:start w:val="1"/>
-      <w:numFmt w:val="bullet"/>
-      <w:lvlText w:val="○"/>
-      <w:lvlJc w:val="left"/>
-      <w:pPr>
-        <w:ind w:left="3600" w:hanging="360"/>
-      </w:pPr>
-      <w:rPr>
-        <w:u w:val="none"/>
-      </w:rPr>
-    </w:lvl>
-    <w:lvl w:ilvl="5">
-      <w:start w:val="1"/>
-      <w:numFmt w:val="bullet"/>
-      <w:lvlText w:val="■"/>
-      <w:lvlJc w:val="left"/>
-      <w:pPr>
-        <w:ind w:left="4320" w:hanging="360"/>
-      </w:pPr>
-      <w:rPr>
-        <w:u w:val="none"/>
-      </w:rPr>
-    </w:lvl>
-    <w:lvl w:ilvl="6">
-      <w:start w:val="1"/>
-      <w:numFmt w:val="bullet"/>
-      <w:lvlText w:val="●"/>
-      <w:lvlJc w:val="left"/>
-      <w:pPr>
-        <w:ind w:left="5040" w:hanging="360"/>
-      </w:pPr>
-      <w:rPr>
-        <w:u w:val="none"/>
-      </w:rPr>
-    </w:lvl>
-    <w:lvl w:ilvl="7">
-      <w:start w:val="1"/>
-      <w:numFmt w:val="bullet"/>
-      <w:lvlText w:val="○"/>
-      <w:lvlJc w:val="left"/>
-      <w:pPr>
-        <w:ind w:left="5760" w:hanging="360"/>
-      </w:pPr>
-      <w:rPr>
-        <w:u w:val="none"/>
-      </w:rPr>
-    </w:lvl>
-    <w:lvl w:ilvl="8">
-      <w:start w:val="1"/>
-      <w:numFmt w:val="bullet"/>
-      <w:lvlText w:val="■"/>
-      <w:lvlJc w:val="left"/>
-      <w:pPr>
-        <w:ind w:left="6480" w:hanging="360"/>
-      </w:pPr>
-      <w:rPr>
-        <w:u w:val="none"/>
-      </w:rPr>
-    </w:lvl>
-  </w:abstractNum>
-  <w:abstractNum w:abstractNumId="9">
-    <w:lvl w:ilvl="0">
-      <w:start w:val="1"/>
-      <w:numFmt w:val="bullet"/>
-      <w:lvlText w:val="●"/>
-      <w:lvlJc w:val="left"/>
-      <w:pPr>
-        <w:ind w:left="720" w:hanging="360"/>
-      </w:pPr>
-      <w:rPr>
-        <w:sz w:val="14"/>
-        <w:szCs w:val="14"/>
-        <w:u w:val="none"/>
-      </w:rPr>
-    </w:lvl>
-    <w:lvl w:ilvl="1">
-      <w:start w:val="1"/>
-      <w:numFmt w:val="bullet"/>
-      <w:lvlText w:val="○"/>
-      <w:lvlJc w:val="left"/>
-      <w:pPr>
-        <w:ind w:left="1440" w:hanging="360"/>
-      </w:pPr>
-      <w:rPr>
-        <w:u w:val="none"/>
-      </w:rPr>
-    </w:lvl>
-    <w:lvl w:ilvl="2">
-      <w:start w:val="1"/>
-      <w:numFmt w:val="bullet"/>
-      <w:lvlText w:val="■"/>
-      <w:lvlJc w:val="left"/>
-      <w:pPr>
-        <w:ind w:left="2160" w:hanging="360"/>
-      </w:pPr>
-      <w:rPr>
-        <w:u w:val="none"/>
-      </w:rPr>
-    </w:lvl>
-    <w:lvl w:ilvl="3">
-      <w:start w:val="1"/>
-      <w:numFmt w:val="bullet"/>
-      <w:lvlText w:val="●"/>
-      <w:lvlJc w:val="left"/>
-      <w:pPr>
-        <w:ind w:left="2880" w:hanging="360"/>
-      </w:pPr>
-      <w:rPr>
-        <w:u w:val="none"/>
-      </w:rPr>
-    </w:lvl>
-    <w:lvl w:ilvl="4">
-      <w:start w:val="1"/>
-      <w:numFmt w:val="bullet"/>
-      <w:lvlText w:val="○"/>
-      <w:lvlJc w:val="left"/>
-      <w:pPr>
-        <w:ind w:left="3600" w:hanging="360"/>
-      </w:pPr>
-      <w:rPr>
-        <w:u w:val="none"/>
-      </w:rPr>
-    </w:lvl>
-    <w:lvl w:ilvl="5">
-      <w:start w:val="1"/>
-      <w:numFmt w:val="bullet"/>
-      <w:lvlText w:val="■"/>
-      <w:lvlJc w:val="left"/>
-      <w:pPr>
-        <w:ind w:left="4320" w:hanging="360"/>
-      </w:pPr>
-      <w:rPr>
-        <w:u w:val="none"/>
-      </w:rPr>
-    </w:lvl>
-    <w:lvl w:ilvl="6">
-      <w:start w:val="1"/>
-      <w:numFmt w:val="bullet"/>
-      <w:lvlText w:val="●"/>
-      <w:lvlJc w:val="left"/>
-      <w:pPr>
-        <w:ind w:left="5040" w:hanging="360"/>
-      </w:pPr>
-      <w:rPr>
-        <w:u w:val="none"/>
-      </w:rPr>
-    </w:lvl>
-    <w:lvl w:ilvl="7">
-      <w:start w:val="1"/>
-      <w:numFmt w:val="bullet"/>
-      <w:lvlText w:val="○"/>
-      <w:lvlJc w:val="left"/>
-      <w:pPr>
-        <w:ind w:left="5760" w:hanging="360"/>
-      </w:pPr>
-      <w:rPr>
-        <w:u w:val="none"/>
-      </w:rPr>
-    </w:lvl>
-    <w:lvl w:ilvl="8">
-      <w:start w:val="1"/>
-      <w:numFmt w:val="bullet"/>
-      <w:lvlText w:val="■"/>
-      <w:lvlJc w:val="left"/>
-      <w:pPr>
-        <w:ind w:left="6480" w:hanging="360"/>
-      </w:pPr>
-      <w:rPr>
-        <w:u w:val="none"/>
-      </w:rPr>
-    </w:lvl>
-  </w:abstractNum>
-  <w:abstractNum w:abstractNumId="10">
-    <w:lvl w:ilvl="0">
-      <w:start w:val="1"/>
-      <w:numFmt w:val="bullet"/>
-      <w:lvlText w:val="●"/>
-      <w:lvlJc w:val="left"/>
-      <w:pPr>
-        <w:ind w:left="720" w:hanging="360"/>
-      </w:pPr>
-      <w:rPr>
-        <w:sz w:val="14"/>
-        <w:szCs w:val="14"/>
-        <w:u w:val="none"/>
-      </w:rPr>
-    </w:lvl>
-    <w:lvl w:ilvl="1">
-      <w:start w:val="1"/>
-      <w:numFmt w:val="bullet"/>
-      <w:lvlText w:val="○"/>
-      <w:lvlJc w:val="left"/>
-      <w:pPr>
-        <w:ind w:left="1440" w:hanging="360"/>
-      </w:pPr>
-      <w:rPr>
-        <w:u w:val="none"/>
-      </w:rPr>
-    </w:lvl>
-    <w:lvl w:ilvl="2">
-      <w:start w:val="1"/>
-      <w:numFmt w:val="bullet"/>
-      <w:lvlText w:val="■"/>
-      <w:lvlJc w:val="left"/>
-      <w:pPr>
-        <w:ind w:left="2160" w:hanging="360"/>
-      </w:pPr>
-      <w:rPr>
-        <w:u w:val="none"/>
-      </w:rPr>
-    </w:lvl>
-    <w:lvl w:ilvl="3">
-      <w:start w:val="1"/>
-      <w:numFmt w:val="bullet"/>
-      <w:lvlText w:val="●"/>
-      <w:lvlJc w:val="left"/>
-      <w:pPr>
-        <w:ind w:left="2880" w:hanging="360"/>
-      </w:pPr>
-      <w:rPr>
-        <w:u w:val="none"/>
-      </w:rPr>
-    </w:lvl>
-    <w:lvl w:ilvl="4">
-      <w:start w:val="1"/>
-      <w:numFmt w:val="bullet"/>
-      <w:lvlText w:val="○"/>
-      <w:lvlJc w:val="left"/>
-      <w:pPr>
-        <w:ind w:left="3600" w:hanging="360"/>
-      </w:pPr>
-      <w:rPr>
-        <w:u w:val="none"/>
-      </w:rPr>
-    </w:lvl>
-    <w:lvl w:ilvl="5">
-      <w:start w:val="1"/>
-      <w:numFmt w:val="bullet"/>
-      <w:lvlText w:val="■"/>
-      <w:lvlJc w:val="left"/>
-      <w:pPr>
-        <w:ind w:left="4320" w:hanging="360"/>
-      </w:pPr>
-      <w:rPr>
-        <w:u w:val="none"/>
-      </w:rPr>
-    </w:lvl>
-    <w:lvl w:ilvl="6">
-      <w:start w:val="1"/>
-      <w:numFmt w:val="bullet"/>
-      <w:lvlText w:val="●"/>
-      <w:lvlJc w:val="left"/>
-      <w:pPr>
-        <w:ind w:left="5040" w:hanging="360"/>
-      </w:pPr>
-      <w:rPr>
-        <w:u w:val="none"/>
-      </w:rPr>
-    </w:lvl>
-    <w:lvl w:ilvl="7">
-      <w:start w:val="1"/>
-      <w:numFmt w:val="bullet"/>
-      <w:lvlText w:val="○"/>
-      <w:lvlJc w:val="left"/>
-      <w:pPr>
-        <w:ind w:left="5760" w:hanging="360"/>
-      </w:pPr>
-      <w:rPr>
-        <w:u w:val="none"/>
-      </w:rPr>
-    </w:lvl>
-    <w:lvl w:ilvl="8">
-      <w:start w:val="1"/>
-      <w:numFmt w:val="bullet"/>
-      <w:lvlText w:val="■"/>
-      <w:lvlJc w:val="left"/>
-      <w:pPr>
-        <w:ind w:left="6480" w:hanging="360"/>
-      </w:pPr>
-      <w:rPr>
-        <w:u w:val="none"/>
-      </w:rPr>
-    </w:lvl>
-  </w:abstractNum>
-  <w:abstractNum w:abstractNumId="11">
     <w:lvl w:ilvl="0">
       <w:start w:val="1"/>
       <w:numFmt w:val="bullet"/>
@@ -3578,18 +2952,6 @@
   </w:num>
   <w:num w:numId="7">
     <w:abstractNumId w:val="7"/>
-  </w:num>
-  <w:num w:numId="8">
-    <w:abstractNumId w:val="8"/>
-  </w:num>
-  <w:num w:numId="9">
-    <w:abstractNumId w:val="9"/>
-  </w:num>
-  <w:num w:numId="10">
-    <w:abstractNumId w:val="10"/>
-  </w:num>
-  <w:num w:numId="11">
-    <w:abstractNumId w:val="11"/>
   </w:num>
 </w:numbering>
 </file>

</xml_diff>